<commit_message>
fixed bullet point issues, removed empty spaces, and minor changes to exploit implementation
</commit_message>
<xml_diff>
--- a/PHP2Shell - Shreyas-M.docx
+++ b/PHP2Shell - Shreyas-M.docx
@@ -1695,12 +1695,12 @@
           <wp:inline distB="0" distT="0" distL="114300" distR="114300">
             <wp:extent cx="6248400" cy="2092072"/>
             <wp:effectExtent b="0" l="0" r="0" t="0"/>
-            <wp:docPr descr="PHP 8.4.26 target returns OK; an oversized multipart POST triggers the memory-limit fatal error in Unknown on line 0." id="1" name="image4.png"/>
+            <wp:docPr descr="PHP 8.4.26 target returns OK; an oversized multipart POST triggers the memory-limit fatal error in Unknown on line 0." id="1" name="image3.png"/>
             <a:graphic>
               <a:graphicData uri="http://schemas.openxmlformats.org/drawingml/2006/picture">
                 <pic:pic>
                   <pic:nvPicPr>
-                    <pic:cNvPr descr="PHP 8.4.26 target returns OK; an oversized multipart POST triggers the memory-limit fatal error in Unknown on line 0." id="0" name="image4.png"/>
+                    <pic:cNvPr descr="PHP 8.4.26 target returns OK; an oversized multipart POST triggers the memory-limit fatal error in Unknown on line 0." id="0" name="image3.png"/>
                     <pic:cNvPicPr preferRelativeResize="0"/>
                   </pic:nvPicPr>
                   <pic:blipFill>
@@ -2218,12 +2218,12 @@
           <wp:inline distB="0" distT="0" distL="114300" distR="114300">
             <wp:extent cx="6248400" cy="2092072"/>
             <wp:effectExtent b="0" l="0" r="0" t="0"/>
-            <wp:docPr descr="Request A triggers OOM and returns HTTP 200; Request B receives no response, the worker PID changes from 18 to 33, and Apache logs an abort." id="3" name="image2.png"/>
+            <wp:docPr descr="Request A triggers OOM and returns HTTP 200; Request B receives no response, the worker PID changes from 18 to 33, and Apache logs an abort." id="3" name="image4.png"/>
             <a:graphic>
               <a:graphicData uri="http://schemas.openxmlformats.org/drawingml/2006/picture">
                 <pic:pic>
                   <pic:nvPicPr>
-                    <pic:cNvPr descr="Request A triggers OOM and returns HTTP 200; Request B receives no response, the worker PID changes from 18 to 33, and Apache logs an abort." id="0" name="image2.png"/>
+                    <pic:cNvPr descr="Request A triggers OOM and returns HTTP 200; Request B receives no response, the worker PID changes from 18 to 33, and Apache logs an abort." id="0" name="image4.png"/>
                     <pic:cNvPicPr preferRelativeResize="0"/>
                   </pic:nvPicPr>
                   <pic:blipFill>
@@ -3566,13 +3566,6 @@
       <w:r>
         <w:rPr>
           <w:rFonts w:ascii="Calibri" w:cs="Calibri" w:eastAsia="Calibri" w:hAnsi="Calibri"/>
-          <w:rtl w:val="0"/>
-        </w:rPr>
-        <w:t xml:space="preserve">• </w:t>
-      </w:r>
-      <w:r>
-        <w:rPr>
-          <w:rFonts w:ascii="Calibri" w:cs="Calibri" w:eastAsia="Calibri" w:hAnsi="Calibri"/>
           <w:b w:val="1"/>
           <w:bCs w:val="1"/>
           <w:color w:val="333333"/>
@@ -3612,13 +3605,6 @@
       <w:r>
         <w:rPr>
           <w:rFonts w:ascii="Calibri" w:cs="Calibri" w:eastAsia="Calibri" w:hAnsi="Calibri"/>
-          <w:rtl w:val="0"/>
-        </w:rPr>
-        <w:t xml:space="preserve">• </w:t>
-      </w:r>
-      <w:r>
-        <w:rPr>
-          <w:rFonts w:ascii="Calibri" w:cs="Calibri" w:eastAsia="Calibri" w:hAnsi="Calibri"/>
           <w:b w:val="1"/>
           <w:bCs w:val="1"/>
           <w:color w:val="333333"/>
@@ -3652,7 +3638,7 @@
           <w:numId w:val="5"/>
         </w:numPr>
         <w:spacing w:after="100" w:line="259" w:lineRule="auto"/>
-        <w:ind w:left="720" w:hanging="480"/>
+        <w:ind w:left="317" w:hanging="230"/>
         <w:rPr/>
       </w:pPr>
       <w:r>
@@ -3718,13 +3704,6 @@
       </w:pPr>
       <w:r>
         <w:rPr>
-          <w:rFonts w:ascii="Calibri" w:cs="Calibri" w:eastAsia="Calibri" w:hAnsi="Calibri"/>
-          <w:rtl w:val="0"/>
-        </w:rPr>
-        <w:t xml:space="preserve">• </w:t>
-      </w:r>
-      <w:r>
-        <w:rPr>
           <w:rFonts w:ascii="Verdana" w:cs="Verdana" w:eastAsia="Verdana" w:hAnsi="Verdana"/>
           <w:color w:val="222222"/>
           <w:sz w:val="18"/>
@@ -3769,13 +3748,6 @@
       </w:pPr>
       <w:r>
         <w:rPr>
-          <w:rFonts w:ascii="Calibri" w:cs="Calibri" w:eastAsia="Calibri" w:hAnsi="Calibri"/>
-          <w:rtl w:val="0"/>
-        </w:rPr>
-        <w:t xml:space="preserve">• </w:t>
-      </w:r>
-      <w:r>
-        <w:rPr>
           <w:rFonts w:ascii="Verdana" w:cs="Verdana" w:eastAsia="Verdana" w:hAnsi="Verdana"/>
           <w:color w:val="222222"/>
           <w:sz w:val="18"/>
@@ -3804,13 +3776,6 @@
       </w:pPr>
       <w:r>
         <w:rPr>
-          <w:rFonts w:ascii="Calibri" w:cs="Calibri" w:eastAsia="Calibri" w:hAnsi="Calibri"/>
-          <w:rtl w:val="0"/>
-        </w:rPr>
-        <w:t xml:space="preserve">• </w:t>
-      </w:r>
-      <w:r>
-        <w:rPr>
           <w:rFonts w:ascii="Verdana" w:cs="Verdana" w:eastAsia="Verdana" w:hAnsi="Verdana"/>
           <w:color w:val="222222"/>
           <w:sz w:val="18"/>
@@ -3904,13 +3869,6 @@
       <w:r>
         <w:rPr>
           <w:rFonts w:ascii="Calibri" w:cs="Calibri" w:eastAsia="Calibri" w:hAnsi="Calibri"/>
-          <w:rtl w:val="0"/>
-        </w:rPr>
-        <w:t xml:space="preserve">• </w:t>
-      </w:r>
-      <w:r>
-        <w:rPr>
-          <w:rFonts w:ascii="Calibri" w:cs="Calibri" w:eastAsia="Calibri" w:hAnsi="Calibri"/>
           <w:color w:val="333333"/>
           <w:sz w:val="21"/>
           <w:szCs w:val="21"/>
@@ -3938,13 +3896,6 @@
       <w:r>
         <w:rPr>
           <w:rFonts w:ascii="Calibri" w:cs="Calibri" w:eastAsia="Calibri" w:hAnsi="Calibri"/>
-          <w:rtl w:val="0"/>
-        </w:rPr>
-        <w:t xml:space="preserve">• </w:t>
-      </w:r>
-      <w:r>
-        <w:rPr>
-          <w:rFonts w:ascii="Calibri" w:cs="Calibri" w:eastAsia="Calibri" w:hAnsi="Calibri"/>
           <w:color w:val="333333"/>
           <w:sz w:val="21"/>
           <w:szCs w:val="21"/>
@@ -3971,13 +3922,6 @@
       </w:pPr>
       <w:r>
         <w:rPr>
-          <w:rFonts w:ascii="Calibri" w:cs="Calibri" w:eastAsia="Calibri" w:hAnsi="Calibri"/>
-          <w:rtl w:val="0"/>
-        </w:rPr>
-        <w:t xml:space="preserve">• </w:t>
-      </w:r>
-      <w:r>
-        <w:rPr>
           <w:b w:val="1"/>
           <w:bCs w:val="1"/>
           <w:rtl w:val="0"/>
@@ -3999,7 +3943,7 @@
           <w:numId w:val="5"/>
         </w:numPr>
         <w:spacing w:after="100" w:line="259" w:lineRule="auto"/>
-        <w:ind w:left="720" w:hanging="480"/>
+        <w:ind w:left="317" w:hanging="230"/>
         <w:rPr/>
       </w:pPr>
       <w:r>
@@ -4034,13 +3978,6 @@
       <w:r>
         <w:rPr>
           <w:rFonts w:ascii="Calibri" w:cs="Calibri" w:eastAsia="Calibri" w:hAnsi="Calibri"/>
-          <w:rtl w:val="0"/>
-        </w:rPr>
-        <w:t xml:space="preserve">• </w:t>
-      </w:r>
-      <w:r>
-        <w:rPr>
-          <w:rFonts w:ascii="Calibri" w:cs="Calibri" w:eastAsia="Calibri" w:hAnsi="Calibri"/>
           <w:color w:val="333333"/>
           <w:sz w:val="21"/>
           <w:szCs w:val="21"/>
@@ -4067,13 +4004,6 @@
       </w:pPr>
       <w:r>
         <w:rPr>
-          <w:rFonts w:ascii="Calibri" w:cs="Calibri" w:eastAsia="Calibri" w:hAnsi="Calibri"/>
-          <w:rtl w:val="0"/>
-        </w:rPr>
-        <w:t xml:space="preserve">• </w:t>
-      </w:r>
-      <w:r>
-        <w:rPr>
           <w:rtl w:val="0"/>
         </w:rPr>
         <w:t xml:space="preserve">Multipart POSTs with thousands of parts, empty </w:t>
@@ -4125,13 +4055,6 @@
       <w:r>
         <w:rPr>
           <w:rFonts w:ascii="Calibri" w:cs="Calibri" w:eastAsia="Calibri" w:hAnsi="Calibri"/>
-          <w:rtl w:val="0"/>
-        </w:rPr>
-        <w:t xml:space="preserve">• </w:t>
-      </w:r>
-      <w:r>
-        <w:rPr>
-          <w:rFonts w:ascii="Calibri" w:cs="Calibri" w:eastAsia="Calibri" w:hAnsi="Calibri"/>
           <w:color w:val="333333"/>
           <w:sz w:val="21"/>
           <w:szCs w:val="21"/>
@@ -4156,13 +4079,6 @@
         <w:ind w:left="317" w:hanging="230"/>
         <w:rPr/>
       </w:pPr>
-      <w:r>
-        <w:rPr>
-          <w:rFonts w:ascii="Calibri" w:cs="Calibri" w:eastAsia="Calibri" w:hAnsi="Calibri"/>
-          <w:rtl w:val="0"/>
-        </w:rPr>
-        <w:t xml:space="preserve">• </w:t>
-      </w:r>
       <w:r>
         <w:rPr>
           <w:rFonts w:ascii="Calibri" w:cs="Calibri" w:eastAsia="Calibri" w:hAnsi="Calibri"/>
@@ -5119,13 +5035,6 @@
       <w:r>
         <w:rPr>
           <w:rFonts w:ascii="Calibri" w:cs="Calibri" w:eastAsia="Calibri" w:hAnsi="Calibri"/>
-          <w:rtl w:val="0"/>
-        </w:rPr>
-        <w:t xml:space="preserve">• </w:t>
-      </w:r>
-      <w:r>
-        <w:rPr>
-          <w:rFonts w:ascii="Calibri" w:cs="Calibri" w:eastAsia="Calibri" w:hAnsi="Calibri"/>
           <w:color w:val="333333"/>
           <w:sz w:val="21"/>
           <w:szCs w:val="21"/>
@@ -5153,13 +5062,6 @@
       <w:r>
         <w:rPr>
           <w:rFonts w:ascii="Calibri" w:cs="Calibri" w:eastAsia="Calibri" w:hAnsi="Calibri"/>
-          <w:rtl w:val="0"/>
-        </w:rPr>
-        <w:t xml:space="preserve">• </w:t>
-      </w:r>
-      <w:r>
-        <w:rPr>
-          <w:rFonts w:ascii="Calibri" w:cs="Calibri" w:eastAsia="Calibri" w:hAnsi="Calibri"/>
           <w:color w:val="333333"/>
           <w:sz w:val="21"/>
           <w:szCs w:val="21"/>
@@ -5187,13 +5089,6 @@
       <w:r>
         <w:rPr>
           <w:rFonts w:ascii="Calibri" w:cs="Calibri" w:eastAsia="Calibri" w:hAnsi="Calibri"/>
-          <w:rtl w:val="0"/>
-        </w:rPr>
-        <w:t xml:space="preserve">• </w:t>
-      </w:r>
-      <w:r>
-        <w:rPr>
-          <w:rFonts w:ascii="Calibri" w:cs="Calibri" w:eastAsia="Calibri" w:hAnsi="Calibri"/>
           <w:color w:val="333333"/>
           <w:sz w:val="21"/>
           <w:szCs w:val="21"/>
@@ -5215,7 +5110,7 @@
           <w:numId w:val="2"/>
         </w:numPr>
         <w:spacing w:after="100" w:line="259" w:lineRule="auto"/>
-        <w:ind w:left="720" w:hanging="480"/>
+        <w:ind w:left="317" w:hanging="230"/>
         <w:rPr/>
       </w:pPr>
       <w:r>
@@ -6089,7 +5984,7 @@
           <w:vertAlign w:val="baseline"/>
           <w:rtl w:val="0"/>
         </w:rPr>
-        <w:t xml:space="preserve">rm -f out/p1 &amp;&amp; python3 exploit.py -u http://127.0.0.1:8088/index.php -c 'id&gt;/out/p1'</w:t>
+        <w:t xml:space="preserve">python3 exploit.py -u http://127.0.0.1:8088/index.php -c 'id&gt;/out/p1'</w:t>
         <w:br w:type="textWrapping"/>
         <w:t xml:space="preserve">cat out/p1</w:t>
       </w:r>
@@ -6108,12 +6003,12 @@
           <wp:inline distB="0" distT="0" distL="114300" distR="114300">
             <wp:extent cx="6248400" cy="2092072"/>
             <wp:effectExtent b="0" l="0" r="0" t="0"/>
-            <wp:docPr descr="The exploit leaks the Zend MM chunk and libphp bases and reports proof as uid 33, www-data." id="2" name="image3.png"/>
+            <wp:docPr descr="The exploit leaks the Zend MM chunk and libphp bases and reports proof as uid 33, www-data." id="2" name="image1.png"/>
             <a:graphic>
               <a:graphicData uri="http://schemas.openxmlformats.org/drawingml/2006/picture">
                 <pic:pic>
                   <pic:nvPicPr>
-                    <pic:cNvPr descr="The exploit leaks the Zend MM chunk and libphp bases and reports proof as uid 33, www-data." id="0" name="image3.png"/>
+                    <pic:cNvPr descr="The exploit leaks the Zend MM chunk and libphp bases and reports proof as uid 33, www-data." id="0" name="image1.png"/>
                     <pic:cNvPicPr preferRelativeResize="0"/>
                   </pic:nvPicPr>
                   <pic:blipFill>
@@ -6185,6 +6080,28 @@
         <w:spacing w:after="100" w:before="60" w:line="240" w:lineRule="auto"/>
         <w:ind w:left="259" w:right="173" w:firstLine="0"/>
         <w:jc w:val="left"/>
+        <w:rPr/>
+      </w:pPr>
+      <w:r>
+        <w:rPr>
+          <w:rFonts w:ascii="Verdana" w:cs="Verdana" w:eastAsia="Verdana" w:hAnsi="Verdana"/>
+          <w:b w:val="0"/>
+          <w:bCs w:val="0"/>
+          <w:i w:val="0"/>
+          <w:iCs w:val="0"/>
+          <w:smallCaps w:val="0"/>
+          <w:strike w:val="0"/>
+          <w:color w:val="222222"/>
+          <w:sz w:val="18"/>
+          <w:szCs w:val="18"/>
+          <w:u w:val="none"/>
+          <w:shd w:fill="auto" w:val="clear"/>
+          <w:vertAlign w:val="baseline"/>
+          <w:rtl w:val="0"/>
+        </w:rPr>
+        <w:t xml:space="preserve">[+] chunk base = 0x7ffffc200000</w:t>
+      </w:r>
+      <w:r>
         <w:rPr>
           <w:rFonts w:ascii="Calibri" w:cs="Calibri" w:eastAsia="Calibri" w:hAnsi="Calibri"/>
           <w:b w:val="0"/>
@@ -6199,8 +6116,10 @@
           <w:u w:val="none"/>
           <w:shd w:fill="auto" w:val="clear"/>
           <w:vertAlign w:val="baseline"/>
-        </w:rPr>
-      </w:pPr>
+          <w:rtl w:val="0"/>
+        </w:rPr>
+        <w:br w:type="textWrapping"/>
+      </w:r>
       <w:r>
         <w:rPr>
           <w:rFonts w:ascii="Verdana" w:cs="Verdana" w:eastAsia="Verdana" w:hAnsi="Verdana"/>
@@ -6218,7 +6137,7 @@
           <w:vertAlign w:val="baseline"/>
           <w:rtl w:val="0"/>
         </w:rPr>
-        <w:t xml:space="preserve">[+] chunk base = 0x7ffffc200000</w:t>
+        <w:t xml:space="preserve">[+] libphp base = 0x7ffffc517000</w:t>
       </w:r>
       <w:r>
         <w:rPr>
@@ -6256,7 +6175,7 @@
           <w:vertAlign w:val="baseline"/>
           <w:rtl w:val="0"/>
         </w:rPr>
-        <w:t xml:space="preserve">[+] libphp base = 0x7ffffc517000</w:t>
+        <w:t xml:space="preserve">[+] W3 attempt 1</w:t>
       </w:r>
       <w:r>
         <w:rPr>
@@ -6294,64 +6213,37 @@
           <w:vertAlign w:val="baseline"/>
           <w:rtl w:val="0"/>
         </w:rPr>
-        <w:t xml:space="preserve">[+] W3 attempt 1</w:t>
-      </w:r>
-      <w:r>
-        <w:rPr>
-          <w:rFonts w:ascii="Calibri" w:cs="Calibri" w:eastAsia="Calibri" w:hAnsi="Calibri"/>
-          <w:b w:val="0"/>
-          <w:bCs w:val="0"/>
-          <w:i w:val="0"/>
-          <w:iCs w:val="0"/>
-          <w:smallCaps w:val="0"/>
-          <w:strike w:val="0"/>
-          <w:color w:val="000000"/>
-          <w:sz w:val="21"/>
-          <w:szCs w:val="21"/>
-          <w:u w:val="none"/>
-          <w:shd w:fill="auto" w:val="clear"/>
-          <w:vertAlign w:val="baseline"/>
+        <w:t xml:space="preserve">PROOF: uid=33(www-data) gid=33(www-data) groups=33(www-data)</w:t>
+      </w:r>
+      <w:r>
+        <w:rPr>
+          <w:rtl w:val="0"/>
+        </w:rPr>
+      </w:r>
+    </w:p>
+    <w:p>
+      <w:pPr>
+        <w:ind w:left="0" w:firstLine="0"/>
+        <w:rPr/>
+      </w:pPr>
+      <w:r>
+        <w:rPr>
           <w:rtl w:val="0"/>
         </w:rPr>
         <w:br w:type="textWrapping"/>
-      </w:r>
-      <w:r>
-        <w:rPr>
-          <w:rFonts w:ascii="Verdana" w:cs="Verdana" w:eastAsia="Verdana" w:hAnsi="Verdana"/>
-          <w:b w:val="0"/>
-          <w:bCs w:val="0"/>
-          <w:i w:val="0"/>
-          <w:iCs w:val="0"/>
-          <w:smallCaps w:val="0"/>
-          <w:strike w:val="0"/>
-          <w:color w:val="222222"/>
-          <w:sz w:val="18"/>
-          <w:szCs w:val="18"/>
-          <w:u w:val="none"/>
-          <w:shd w:fill="auto" w:val="clear"/>
-          <w:vertAlign w:val="baseline"/>
-          <w:rtl w:val="0"/>
-        </w:rPr>
-        <w:t xml:space="preserve">PROOF: uid=33(www-data) gid=33(www-data) groups=33(www-data)</w:t>
-      </w:r>
-      <w:r>
-        <w:rPr>
-          <w:rtl w:val="0"/>
-        </w:rPr>
-      </w:r>
-    </w:p>
-    <w:p>
-      <w:pPr>
-        <w:pageBreakBefore w:val="1"/>
-        <w:widowControl w:val="1"/>
-        <w:spacing w:after="100" w:line="259" w:lineRule="auto"/>
-        <w:rPr/>
-      </w:pPr>
-      <w:r>
-        <w:rPr>
-          <w:rtl w:val="0"/>
-        </w:rPr>
-        <w:t xml:space="preserve">4. Compare the same exploit against the PHP 8.4.27 control. The control used the same PHP configuration and pinned base image; Debian package versions were resolved at build time, so this is a recorded differential rather than a byte-for-byte reproducible build.</w:t>
+        <w:t xml:space="preserve">4. </w:t>
+      </w:r>
+      <w:r>
+        <w:rPr>
+          <w:rtl w:val="0"/>
+        </w:rPr>
+        <w:t xml:space="preserve">Compare the same exploit against the PHP 8.4.27 control. The control used the same PHP configuration and pinned base image; Debian package versions were resolved at build time, so this is a recorded differential rather than a byte-for-byte reproducible build.</w:t>
+        <w:br w:type="textWrapping"/>
+      </w:r>
+      <w:r>
+        <w:rPr>
+          <w:rtl w:val="0"/>
+        </w:rPr>
       </w:r>
     </w:p>
     <w:p>
@@ -6427,12 +6319,12 @@
           <wp:inline distB="0" distT="0" distL="114300" distR="114300">
             <wp:extent cx="6248400" cy="2092072"/>
             <wp:effectExtent b="0" l="0" r="0" t="0"/>
-            <wp:docPr descr="The PHP 8.4.27 differential run fails at the heap-leak stage; the proof file is absent and the target returns OK." id="4" name="image1.png"/>
+            <wp:docPr descr="The PHP 8.4.27 differential run fails at the heap-leak stage; the proof file is absent and the target returns OK." id="4" name="image2.png"/>
             <a:graphic>
               <a:graphicData uri="http://schemas.openxmlformats.org/drawingml/2006/picture">
                 <pic:pic>
                   <pic:nvPicPr>
-                    <pic:cNvPr descr="The PHP 8.4.27 differential run fails at the heap-leak stage; the proof file is absent and the target returns OK." id="0" name="image1.png"/>
+                    <pic:cNvPr descr="The PHP 8.4.27 differential run fails at the heap-leak stage; the proof file is absent and the target returns OK." id="0" name="image2.png"/>
                     <pic:cNvPicPr preferRelativeResize="0"/>
                   </pic:nvPicPr>
                   <pic:blipFill>
@@ -6538,20 +6430,18 @@
       <w:r>
         <w:rPr>
           <w:rFonts w:ascii="Verdana" w:cs="Verdana" w:eastAsia="Verdana" w:hAnsi="Verdana"/>
-          <w:b w:val="0"/>
-          <w:bCs w:val="0"/>
-          <w:color w:val="222222"/>
-          <w:sz w:val="18"/>
-          <w:szCs w:val="18"/>
-          <w:rtl w:val="0"/>
-        </w:rPr>
-        <w:t xml:space="preserve">id</w:t>
-      </w:r>
-      <w:r>
-        <w:rPr>
-          <w:rtl w:val="0"/>
-        </w:rPr>
-        <w:t xml:space="preserve"> succeeding in three of three attempts, plus an arbitrary multi-command script.</w:t>
+          <w:color w:val="222222"/>
+          <w:sz w:val="18"/>
+          <w:szCs w:val="18"/>
+          <w:rtl w:val="0"/>
+        </w:rPr>
+        <w:t xml:space="preserve">are succeeding</w:t>
+      </w:r>
+      <w:r>
+        <w:rPr>
+          <w:rtl w:val="0"/>
+        </w:rPr>
+        <w:t xml:space="preserve"> in three of three attempts, plus an arbitrary multi-command script.</w:t>
       </w:r>
     </w:p>
     <w:p>

</xml_diff>

<commit_message>
Minor clarity update to reproduction steps, and added a not to ensure offsets are not carried over among different versions during testing.
</commit_message>
<xml_diff>
--- a/PHP2Shell - Shreyas-M.docx
+++ b/PHP2Shell - Shreyas-M.docx
@@ -1695,12 +1695,12 @@
           <wp:inline distB="0" distT="0" distL="114300" distR="114300">
             <wp:extent cx="6248400" cy="2092072"/>
             <wp:effectExtent b="0" l="0" r="0" t="0"/>
-            <wp:docPr descr="PHP 8.4.26 target returns OK; an oversized multipart POST triggers the memory-limit fatal error in Unknown on line 0." id="1" name="image3.png"/>
+            <wp:docPr descr="PHP 8.4.26 target returns OK; an oversized multipart POST triggers the memory-limit fatal error in Unknown on line 0." id="1" name="image1.png"/>
             <a:graphic>
               <a:graphicData uri="http://schemas.openxmlformats.org/drawingml/2006/picture">
                 <pic:pic>
                   <pic:nvPicPr>
-                    <pic:cNvPr descr="PHP 8.4.26 target returns OK; an oversized multipart POST triggers the memory-limit fatal error in Unknown on line 0." id="0" name="image3.png"/>
+                    <pic:cNvPr descr="PHP 8.4.26 target returns OK; an oversized multipart POST triggers the memory-limit fatal error in Unknown on line 0." id="0" name="image1.png"/>
                     <pic:cNvPicPr preferRelativeResize="0"/>
                   </pic:nvPicPr>
                   <pic:blipFill>
@@ -4668,61 +4668,13 @@
         <w:rPr>
           <w:rtl w:val="0"/>
         </w:rPr>
-        <w:t xml:space="preserve">The vulnerable target was the official </w:t>
-      </w:r>
-      <w:r>
-        <w:rPr>
-          <w:rFonts w:ascii="Verdana" w:cs="Verdana" w:eastAsia="Verdana" w:hAnsi="Verdana"/>
-          <w:b w:val="0"/>
-          <w:bCs w:val="0"/>
-          <w:color w:val="222222"/>
-          <w:sz w:val="18"/>
-          <w:szCs w:val="18"/>
-          <w:rtl w:val="0"/>
-        </w:rPr>
-        <w:t xml:space="preserve">php:8.4.26-apache</w:t>
-      </w:r>
-      <w:r>
-        <w:rPr>
-          <w:rtl w:val="0"/>
-        </w:rPr>
-        <w:t xml:space="preserve"> image, pinned to digest </w:t>
-      </w:r>
-      <w:r>
-        <w:rPr>
-          <w:rFonts w:ascii="Verdana" w:cs="Verdana" w:eastAsia="Verdana" w:hAnsi="Verdana"/>
-          <w:b w:val="0"/>
-          <w:bCs w:val="0"/>
-          <w:color w:val="222222"/>
-          <w:sz w:val="18"/>
-          <w:szCs w:val="18"/>
-          <w:rtl w:val="0"/>
-        </w:rPr>
-        <w:t xml:space="preserve">sha256:60111400ff77bdc44fa79b4f072afe49a42abba71e0846ad496be4761dc9c11a</w:t>
-      </w:r>
-      <w:r>
-        <w:rPr>
-          <w:rtl w:val="0"/>
-        </w:rPr>
-        <w:t xml:space="preserve"> on </w:t>
-      </w:r>
-      <w:r>
-        <w:rPr>
-          <w:rFonts w:ascii="Verdana" w:cs="Verdana" w:eastAsia="Verdana" w:hAnsi="Verdana"/>
-          <w:b w:val="0"/>
-          <w:bCs w:val="0"/>
-          <w:color w:val="222222"/>
-          <w:sz w:val="18"/>
-          <w:szCs w:val="18"/>
-          <w:rtl w:val="0"/>
-        </w:rPr>
-        <w:t xml:space="preserve">linux/amd64</w:t>
-      </w:r>
-      <w:r>
-        <w:rPr>
-          <w:rtl w:val="0"/>
-        </w:rPr>
-        <w:t xml:space="preserve">. The captured image ran Debian bookworm and Apache 2.4.68; the mutable tag has since been rebuilt with Apache 2.4.69. The lab used Apache </w:t>
+        <w:t xml:space="preserve">The vulnerable target was the official php:8.4.26-apache image on linux/amd64, pinned by digest sha256:60111400ff77bdc44fa79b4f072afe49a42abba71e0846ad496be4761dc9c11a (Apache 2.4.69, libphp.so sha256 51663cf883b1223436d4c99f31dd0225735ea5573665e4242621eee7f4ee679c). The recorded runs used the sibling official tag php:8.4.26-apache-bookworm, digest sha256:52f04cd1e398edd0f80afa8330ce73bce61931ddbd0d5bdd919c6f914d02bcf8 (Apache 2.4.68, libphp.so sha256 ff3ea77fb119541f6d10ddf0fa7e9e3fd6a3043e049a536b530dbbec35db68d6). Both tags are published and pair the same PHP release with different Apache builds; we ran the complete chain on both, and the pinned image succeeded with the exploit's automatic offset derivation. The libphp symbol offsets differ between the two builds, so do not carry offsets from one build to the other or from older notes; the exploit reads them from the running container.</w:t>
+      </w:r>
+      <w:r>
+        <w:rPr>
+          <w:rtl w:val="0"/>
+        </w:rPr>
+        <w:t xml:space="preserve"> The lab used Apache </w:t>
       </w:r>
       <w:r>
         <w:rPr>
@@ -4976,15 +4928,21 @@
     </w:p>
     <w:p>
       <w:pPr>
-        <w:widowControl w:val="1"/>
-        <w:spacing w:after="100" w:line="259" w:lineRule="auto"/>
-        <w:rPr/>
-      </w:pPr>
-      <w:r>
-        <w:rPr>
-          <w:rtl w:val="0"/>
-        </w:rPr>
-        <w:t xml:space="preserve">The PHP 8.4.27 control used the same lab settings and base-image digest. It was built from the official PHP source tarball with its checksum verified; Debian package versions were resolved at build time and were not pinned.</w:t>
+        <w:spacing w:line="259" w:lineRule="auto"/>
+        <w:rPr/>
+      </w:pPr>
+      <w:r>
+        <w:rPr>
+          <w:color w:val="1d1c1d"/>
+          <w:rtl w:val="0"/>
+        </w:rPr>
+        <w:t xml:space="preserve">The PHP 8.4.27 control used the same lab settings on a digest-pinned Debian 12 base image.</w:t>
+      </w:r>
+      <w:r>
+        <w:rPr>
+          <w:rtl w:val="0"/>
+        </w:rPr>
+        <w:t xml:space="preserve"> It was built from the official PHP source tarball with its checksum verified; Debian package versions were resolved at build time and were not pinned.</w:t>
       </w:r>
     </w:p>
     <w:p>
@@ -6003,12 +5961,12 @@
           <wp:inline distB="0" distT="0" distL="114300" distR="114300">
             <wp:extent cx="6248400" cy="2092072"/>
             <wp:effectExtent b="0" l="0" r="0" t="0"/>
-            <wp:docPr descr="The exploit leaks the Zend MM chunk and libphp bases and reports proof as uid 33, www-data." id="2" name="image1.png"/>
+            <wp:docPr descr="The exploit leaks the Zend MM chunk and libphp bases and reports proof as uid 33, www-data." id="2" name="image2.png"/>
             <a:graphic>
               <a:graphicData uri="http://schemas.openxmlformats.org/drawingml/2006/picture">
                 <pic:pic>
                   <pic:nvPicPr>
-                    <pic:cNvPr descr="The exploit leaks the Zend MM chunk and libphp bases and reports proof as uid 33, www-data." id="0" name="image1.png"/>
+                    <pic:cNvPr descr="The exploit leaks the Zend MM chunk and libphp bases and reports proof as uid 33, www-data." id="0" name="image2.png"/>
                     <pic:cNvPicPr preferRelativeResize="0"/>
                   </pic:nvPicPr>
                   <pic:blipFill>
@@ -6319,12 +6277,12 @@
           <wp:inline distB="0" distT="0" distL="114300" distR="114300">
             <wp:extent cx="6248400" cy="2092072"/>
             <wp:effectExtent b="0" l="0" r="0" t="0"/>
-            <wp:docPr descr="The PHP 8.4.27 differential run fails at the heap-leak stage; the proof file is absent and the target returns OK." id="4" name="image2.png"/>
+            <wp:docPr descr="The PHP 8.4.27 differential run fails at the heap-leak stage; the proof file is absent and the target returns OK." id="4" name="image3.png"/>
             <a:graphic>
               <a:graphicData uri="http://schemas.openxmlformats.org/drawingml/2006/picture">
                 <pic:pic>
                   <pic:nvPicPr>
-                    <pic:cNvPr descr="The PHP 8.4.27 differential run fails at the heap-leak stage; the proof file is absent and the target returns OK." id="0" name="image2.png"/>
+                    <pic:cNvPr descr="The PHP 8.4.27 differential run fails at the heap-leak stage; the proof file is absent and the target returns OK." id="0" name="image3.png"/>
                     <pic:cNvPicPr preferRelativeResize="0"/>
                   </pic:nvPicPr>
                   <pic:blipFill>

</xml_diff>